<commit_message>
Keep the homepage name on one line at iPhone width and drop locality from the résumé.
The Polygon grants dollar figure and the largest-in-history claim are not in the sources, so that copy is unchanged.
</commit_message>
<xml_diff>
--- a/Justice_Conder_Resume.docx
+++ b/Justice_Conder_Resume.docx
@@ -24,14 +24,6 @@
       </w:pPr>
       <w:r>
         <w:t>Applied AI | Agent Infrastructure | Full-Stack Systems</w:t>
-      </w:r>
-    </w:p>
-    <w:p>
-      <w:pPr>
-        <w:pStyle w:val="Contact"/>
-      </w:pPr>
-      <w:r>
-        <w:t>Kent, Ohio | U.S. remote and Northeast Ohio opportunities</w:t>
       </w:r>
     </w:p>
     <w:p>

</xml_diff>